<commit_message>
fix: correct date ranges for FlyRank AI internship (July 2026 – Sept 2026) and Complete Web Development Course (Dec 2025 – Jun 2026)
</commit_message>
<xml_diff>
--- a/public/RESUME.docx
+++ b/public/RESUME.docx
@@ -221,7 +221,7 @@
           <w:color w:val="000000"/>
           <w:sz w:val="17"/>
         </w:rPr>
-        <w:t xml:space="preserve"> | Jan 2026 – Sept 2026</w:t>
+        <w:t xml:space="preserve"> | July 2026 – Sept 2026</w:t>
       </w:r>
     </w:p>
     <w:p>
@@ -288,7 +288,7 @@
           <w:color w:val="000000"/>
           <w:sz w:val="17"/>
         </w:rPr>
-        <w:t xml:space="preserve"> | Jan 2026 – Jun 2026</w:t>
+        <w:t xml:space="preserve"> | Dec 2025 – Jun 2026</w:t>
       </w:r>
     </w:p>
     <w:p>

</xml_diff>